<commit_message>
docs: record CR approval scope in Lab 3 form
</commit_message>
<xml_diff>
--- a/docs/lab3/Phieu_thuc_hanh_Lab3_Techvora.docx
+++ b/docs/lab3/Phieu_thuc_hanh_Lab3_Techvora.docx
@@ -3354,7 +3354,7 @@
                 <w:rFonts w:ascii="Times New Roman" w:hAnsi="Times New Roman"/>
                 <w:sz w:val="21"/>
               </w:rPr>
-              <w:t>Đã triển khai để review qua PR #1; chưa có quyết định merge.</w:t>
+              <w:t>Approve triển khai trên branch theo yêu cầu chủ repo; merge chờ review PR #1.</w:t>
             </w:r>
           </w:p>
         </w:tc>
@@ -3825,7 +3825,7 @@
                 <w:rFonts w:ascii="Times New Roman" w:hAnsi="Times New Roman"/>
                 <w:sz w:val="21"/>
               </w:rPr>
-              <w:t>Valid/Boundary</w:t>
+              <w:t>Valid</w:t>
             </w:r>
           </w:p>
         </w:tc>

</xml_diff>

<commit_message>
docs: correct Lab 3 member attribution
</commit_message>
<xml_diff>
--- a/docs/lab3/Phieu_thuc_hanh_Lab3_Techvora.docx
+++ b/docs/lab3/Phieu_thuc_hanh_Lab3_Techvora.docx
@@ -1820,7 +1820,7 @@
                 <w:rFonts w:ascii="Times New Roman" w:hAnsi="Times New Roman"/>
                 <w:sz w:val="21"/>
               </w:rPr>
-              <w:t>Branch từ main: feature/*, fix/*, docs/*; tác vụ Codex dùng codex/*.</w:t>
+              <w:t>Tạo branch riêng từ main, đặt tên theo mục đích thay đổi (feature/*, fix/*, docs/*).</w:t>
             </w:r>
           </w:p>
         </w:tc>
@@ -2417,7 +2417,7 @@
                 <w:rFonts w:ascii="Times New Roman" w:hAnsi="Times New Roman"/>
                 <w:sz w:val="19"/>
               </w:rPr>
-              <w:t>@Anhtuan2005 (Codex hỗ trợ)</w:t>
+              <w:t>Nguyễn Trương Anh Tuấn (@Anhtuan2005)</w:t>
             </w:r>
           </w:p>
         </w:tc>
@@ -2532,6 +2532,13 @@
                 <w:szCs w:val="28"/>
               </w:rPr>
             </w:pPr>
+            <w:r>
+              <w:rPr>
+                <w:rFonts w:ascii="Times New Roman" w:hAnsi="Times New Roman"/>
+                <w:sz w:val="19"/>
+              </w:rPr>
+              <w:t>Trần Tấn Phát</w:t>
+            </w:r>
           </w:p>
         </w:tc>
         <w:tc>
@@ -2617,6 +2624,13 @@
                 <w:szCs w:val="28"/>
               </w:rPr>
             </w:pPr>
+            <w:r>
+              <w:rPr>
+                <w:rFonts w:ascii="Times New Roman" w:hAnsi="Times New Roman"/>
+                <w:sz w:val="19"/>
+              </w:rPr>
+              <w:t>Trương Đức Phú</w:t>
+            </w:r>
           </w:p>
         </w:tc>
         <w:tc>
@@ -2702,6 +2716,13 @@
                 <w:szCs w:val="28"/>
               </w:rPr>
             </w:pPr>
+            <w:r>
+              <w:rPr>
+                <w:rFonts w:ascii="Times New Roman" w:hAnsi="Times New Roman"/>
+                <w:sz w:val="19"/>
+              </w:rPr>
+              <w:t>Bùi Phạm Phong Phú</w:t>
+            </w:r>
           </w:p>
         </w:tc>
         <w:tc>
@@ -3146,7 +3167,7 @@
                 <w:rFonts w:ascii="Times New Roman" w:hAnsi="Times New Roman"/>
                 <w:sz w:val="21"/>
               </w:rPr>
-              <w:t>Codex đề xuất theo yêu cầu Lab 3; nhóm cần xác nhận người đề xuất.</w:t>
+              <w:t>Chưa xác nhận người đề xuất chính thức trong nhóm.</w:t>
             </w:r>
           </w:p>
         </w:tc>
@@ -4590,7 +4611,7 @@
           <w:rFonts w:ascii="Times New Roman" w:hAnsi="Times New Roman"/>
           <w:sz w:val="22"/>
         </w:rPr>
-        <w:t>Còn cần nhóm xác nhận: lớp và thành viên, quyền truy cập, tài liệu Tuần 1–2, đóng góp từng người, review và merge PR #1. Repository hiện chỉ có một collaborator.</w:t>
+        <w:t>Còn cần nhóm xác nhận: lớp, quyền truy cập, tài liệu Tuần 1–2, branch/commit của ba thành viên còn lại, review và merge PR #1.</w:t>
       </w:r>
     </w:p>
     <w:p>

</xml_diff>

<commit_message>
docs: add planned Lab 3 work for remaining members
</commit_message>
<xml_diff>
--- a/docs/lab3/Phieu_thuc_hanh_Lab3_Techvora.docx
+++ b/docs/lab3/Phieu_thuc_hanh_Lab3_Techvora.docx
@@ -2555,6 +2555,13 @@
                 <w:szCs w:val="28"/>
               </w:rPr>
             </w:pPr>
+            <w:r>
+              <w:rPr>
+                <w:rFonts w:ascii="Times New Roman" w:hAnsi="Times New Roman"/>
+                <w:sz w:val="19"/>
+              </w:rPr>
+              <w:t>Dự kiến: feature/us02-account</w:t>
+            </w:r>
           </w:p>
         </w:tc>
         <w:tc>
@@ -2571,6 +2578,13 @@
                 <w:szCs w:val="28"/>
               </w:rPr>
             </w:pPr>
+            <w:r>
+              <w:rPr>
+                <w:rFonts w:ascii="Times New Roman" w:hAnsi="Times New Roman"/>
+                <w:sz w:val="19"/>
+              </w:rPr>
+              <w:t>US-02: đăng ký và hồ sơ</w:t>
+            </w:r>
           </w:p>
         </w:tc>
         <w:tc>
@@ -2587,6 +2601,13 @@
                 <w:szCs w:val="28"/>
               </w:rPr>
             </w:pPr>
+            <w:r>
+              <w:rPr>
+                <w:rFonts w:ascii="Times New Roman" w:hAnsi="Times New Roman"/>
+                <w:sz w:val="19"/>
+              </w:rPr>
+              <w:t>Mẫu: feat: improve account profile</w:t>
+            </w:r>
           </w:p>
         </w:tc>
         <w:tc>
@@ -2603,6 +2624,13 @@
                 <w:szCs w:val="28"/>
               </w:rPr>
             </w:pPr>
+            <w:r>
+              <w:rPr>
+                <w:rFonts w:ascii="Times New Roman" w:hAnsi="Times New Roman"/>
+                <w:sz w:val="19"/>
+              </w:rPr>
+              <w:t>Dự kiến; chưa có PR/merge</w:t>
+            </w:r>
           </w:p>
         </w:tc>
       </w:tr>
@@ -2647,6 +2675,13 @@
                 <w:szCs w:val="28"/>
               </w:rPr>
             </w:pPr>
+            <w:r>
+              <w:rPr>
+                <w:rFonts w:ascii="Times New Roman" w:hAnsi="Times New Roman"/>
+                <w:sz w:val="19"/>
+              </w:rPr>
+              <w:t>Dự kiến: feature/us12-checkout</w:t>
+            </w:r>
           </w:p>
         </w:tc>
         <w:tc>
@@ -2663,6 +2698,13 @@
                 <w:szCs w:val="28"/>
               </w:rPr>
             </w:pPr>
+            <w:r>
+              <w:rPr>
+                <w:rFonts w:ascii="Times New Roman" w:hAnsi="Times New Roman"/>
+                <w:sz w:val="19"/>
+              </w:rPr>
+              <w:t>US-12: địa chỉ và phí giao hàng</w:t>
+            </w:r>
           </w:p>
         </w:tc>
         <w:tc>
@@ -2679,6 +2721,13 @@
                 <w:szCs w:val="28"/>
               </w:rPr>
             </w:pPr>
+            <w:r>
+              <w:rPr>
+                <w:rFonts w:ascii="Times New Roman" w:hAnsi="Times New Roman"/>
+                <w:sz w:val="19"/>
+              </w:rPr>
+              <w:t>Mẫu: feat: validate checkout address</w:t>
+            </w:r>
           </w:p>
         </w:tc>
         <w:tc>
@@ -2695,6 +2744,13 @@
                 <w:szCs w:val="28"/>
               </w:rPr>
             </w:pPr>
+            <w:r>
+              <w:rPr>
+                <w:rFonts w:ascii="Times New Roman" w:hAnsi="Times New Roman"/>
+                <w:sz w:val="19"/>
+              </w:rPr>
+              <w:t>Dự kiến; chưa có PR/merge</w:t>
+            </w:r>
           </w:p>
         </w:tc>
       </w:tr>
@@ -2739,6 +2795,13 @@
                 <w:szCs w:val="28"/>
               </w:rPr>
             </w:pPr>
+            <w:r>
+              <w:rPr>
+                <w:rFonts w:ascii="Times New Roman" w:hAnsi="Times New Roman"/>
+                <w:sz w:val="19"/>
+              </w:rPr>
+              <w:t>Dự kiến: feature/us16-catalog</w:t>
+            </w:r>
           </w:p>
         </w:tc>
         <w:tc>
@@ -2755,6 +2818,13 @@
                 <w:szCs w:val="28"/>
               </w:rPr>
             </w:pPr>
+            <w:r>
+              <w:rPr>
+                <w:rFonts w:ascii="Times New Roman" w:hAnsi="Times New Roman"/>
+                <w:sz w:val="19"/>
+              </w:rPr>
+              <w:t>US-16: quản lý sản phẩm và banner</w:t>
+            </w:r>
           </w:p>
         </w:tc>
         <w:tc>
@@ -2771,6 +2841,13 @@
                 <w:szCs w:val="28"/>
               </w:rPr>
             </w:pPr>
+            <w:r>
+              <w:rPr>
+                <w:rFonts w:ascii="Times New Roman" w:hAnsi="Times New Roman"/>
+                <w:sz w:val="19"/>
+              </w:rPr>
+              <w:t>Mẫu: feat: update admin catalog</w:t>
+            </w:r>
           </w:p>
         </w:tc>
         <w:tc>
@@ -2787,6 +2864,13 @@
                 <w:szCs w:val="28"/>
               </w:rPr>
             </w:pPr>
+            <w:r>
+              <w:rPr>
+                <w:rFonts w:ascii="Times New Roman" w:hAnsi="Times New Roman"/>
+                <w:sz w:val="19"/>
+              </w:rPr>
+              <w:t>Dự kiến; chưa có PR/merge</w:t>
+            </w:r>
           </w:p>
         </w:tc>
       </w:tr>
@@ -2808,6 +2892,13 @@
                 <w:szCs w:val="28"/>
               </w:rPr>
             </w:pPr>
+            <w:r>
+              <w:rPr>
+                <w:rFonts w:ascii="Times New Roman" w:hAnsi="Times New Roman"/>
+                <w:sz w:val="19"/>
+              </w:rPr>
+              <w:t>Không áp dụng (nhóm 4 người)</w:t>
+            </w:r>
           </w:p>
         </w:tc>
         <w:tc>
@@ -2824,6 +2915,13 @@
                 <w:szCs w:val="28"/>
               </w:rPr>
             </w:pPr>
+            <w:r>
+              <w:rPr>
+                <w:rFonts w:ascii="Times New Roman" w:hAnsi="Times New Roman"/>
+                <w:sz w:val="19"/>
+              </w:rPr>
+              <w:t>—</w:t>
+            </w:r>
           </w:p>
         </w:tc>
         <w:tc>
@@ -2840,6 +2938,13 @@
                 <w:szCs w:val="28"/>
               </w:rPr>
             </w:pPr>
+            <w:r>
+              <w:rPr>
+                <w:rFonts w:ascii="Times New Roman" w:hAnsi="Times New Roman"/>
+                <w:sz w:val="19"/>
+              </w:rPr>
+              <w:t>—</w:t>
+            </w:r>
           </w:p>
         </w:tc>
         <w:tc>
@@ -2856,6 +2961,13 @@
                 <w:szCs w:val="28"/>
               </w:rPr>
             </w:pPr>
+            <w:r>
+              <w:rPr>
+                <w:rFonts w:ascii="Times New Roman" w:hAnsi="Times New Roman"/>
+                <w:sz w:val="19"/>
+              </w:rPr>
+              <w:t>—</w:t>
+            </w:r>
           </w:p>
         </w:tc>
         <w:tc>
@@ -2872,6 +2984,13 @@
                 <w:szCs w:val="28"/>
               </w:rPr>
             </w:pPr>
+            <w:r>
+              <w:rPr>
+                <w:rFonts w:ascii="Times New Roman" w:hAnsi="Times New Roman"/>
+                <w:sz w:val="19"/>
+              </w:rPr>
+              <w:t>—</w:t>
+            </w:r>
           </w:p>
         </w:tc>
       </w:tr>
@@ -4611,7 +4730,7 @@
           <w:rFonts w:ascii="Times New Roman" w:hAnsi="Times New Roman"/>
           <w:sz w:val="22"/>
         </w:rPr>
-        <w:t>Còn cần nhóm xác nhận: lớp, quyền truy cập, tài liệu Tuần 1–2, branch/commit của ba thành viên còn lại, review và merge PR #1.</w:t>
+        <w:t>Còn cần nhóm xác nhận: lớp, quyền truy cập, tài liệu Tuần 1–2, branch/commit thực tế của ba thành viên còn lại, review và merge PR #1.</w:t>
       </w:r>
     </w:p>
     <w:p>

</xml_diff>

<commit_message>
docs: align Lab 3 report with team backlog and Git history
</commit_message>
<xml_diff>
--- a/docs/lab3/Phieu_thuc_hanh_Lab3_Techvora.docx
+++ b/docs/lab3/Phieu_thuc_hanh_Lab3_Techvora.docx
@@ -603,7 +603,7 @@
                 <w:rFonts w:ascii="Times New Roman" w:hAnsi="Times New Roman"/>
                 <w:sz w:val="20"/>
               </w:rPr>
-              <w:t>README.md</w:t>
+              <w:t>README.md; docs/requirements/</w:t>
             </w:r>
           </w:p>
         </w:tc>
@@ -723,7 +723,7 @@
                 <w:rFonts w:ascii="Times New Roman" w:hAnsi="Times New Roman"/>
                 <w:sz w:val="20"/>
               </w:rPr>
-              <w:t>Views/; wwwroot/; docs/screenshots/</w:t>
+              <w:t>src/backend/Views/; docs/design/</w:t>
             </w:r>
           </w:p>
         </w:tc>
@@ -843,7 +843,7 @@
                 <w:rFonts w:ascii="Times New Roman" w:hAnsi="Times New Roman"/>
                 <w:sz w:val="20"/>
               </w:rPr>
-              <w:t>Controllers/; Services/; Models/</w:t>
+              <w:t>src/backend/Controllers/; Services/; Models/</w:t>
             </w:r>
           </w:p>
         </w:tc>
@@ -963,7 +963,7 @@
                 <w:rFonts w:ascii="Times New Roman" w:hAnsi="Times New Roman"/>
                 <w:sz w:val="20"/>
               </w:rPr>
-              <w:t>Data/; Data/Migrations/</w:t>
+              <w:t>database/schema/; database/seed/</w:t>
             </w:r>
           </w:p>
         </w:tc>
@@ -1083,7 +1083,7 @@
                 <w:rFonts w:ascii="Times New Roman" w:hAnsi="Times New Roman"/>
                 <w:sz w:val="20"/>
               </w:rPr>
-              <w:t>appsettings.json; *.csproj</w:t>
+              <w:t>src/backend/appsettings.json; *.csproj</w:t>
             </w:r>
           </w:p>
         </w:tc>
@@ -1203,7 +1203,7 @@
                 <w:rFonts w:ascii="Times New Roman" w:hAnsi="Times New Roman"/>
                 <w:sz w:val="20"/>
               </w:rPr>
-              <w:t>tests/; evidence/lab3/</w:t>
+              <w:t>test/test-cases/; test/test-data/</w:t>
             </w:r>
           </w:p>
         </w:tc>
@@ -1664,7 +1664,7 @@
                 <w:rFonts w:ascii="Times New Roman" w:hAnsi="Times New Roman"/>
                 <w:sz w:val="21"/>
               </w:rPr>
-              <w:t>Giữ MVC hiện có; hồ sơ tại docs/lab3/, test tại tests/, dữ liệu tại evidence/.</w:t>
+              <w:t>docs/ lưu tài liệu; src/ lưu mã; database/ lưu schema/seed; test/ lưu kiểm thử.</w:t>
             </w:r>
           </w:p>
         </w:tc>
@@ -2142,7 +2142,7 @@
           <w:sz w:val="28"/>
           <w:szCs w:val="28"/>
         </w:rPr>
-        <w:t>☐</w:t>
+        <w:t>☑</w:t>
       </w:r>
       <w:r>
         <w:rPr>
@@ -2509,7 +2509,7 @@
                 <w:rFonts w:ascii="Times New Roman" w:hAnsi="Times New Roman"/>
                 <w:sz w:val="19"/>
               </w:rPr>
-              <w:t>PR #1 mở; chờ review/merge</w:t>
+              <w:t>PR #1 đã merge; chưa có review</w:t>
             </w:r>
           </w:p>
         </w:tc>
@@ -2560,7 +2560,7 @@
                 <w:rFonts w:ascii="Times New Roman" w:hAnsi="Times New Roman"/>
                 <w:sz w:val="19"/>
               </w:rPr>
-              <w:t>Dự kiến: feature/us02-account</w:t>
+              <w:t>main</w:t>
             </w:r>
           </w:p>
         </w:tc>
@@ -2583,7 +2583,7 @@
                 <w:rFonts w:ascii="Times New Roman" w:hAnsi="Times New Roman"/>
                 <w:sz w:val="19"/>
               </w:rPr>
-              <w:t>US-02: đăng ký và hồ sơ</w:t>
+              <w:t>Sửa hướng dẫn demo; backlog US-02/09/03</w:t>
             </w:r>
           </w:p>
         </w:tc>
@@ -2606,7 +2606,7 @@
                 <w:rFonts w:ascii="Times New Roman" w:hAnsi="Times New Roman"/>
                 <w:sz w:val="19"/>
               </w:rPr>
-              <w:t>Mẫu: feat: improve account profile</w:t>
+              <w:t>49efeda update demo.md</w:t>
             </w:r>
           </w:p>
         </w:tc>
@@ -2629,7 +2629,7 @@
                 <w:rFonts w:ascii="Times New Roman" w:hAnsi="Times New Roman"/>
                 <w:sz w:val="19"/>
               </w:rPr>
-              <w:t>Dự kiến; chưa có PR/merge</w:t>
+              <w:t>Đã trên main; không qua PR</w:t>
             </w:r>
           </w:p>
         </w:tc>
@@ -2703,7 +2703,7 @@
                 <w:rFonts w:ascii="Times New Roman" w:hAnsi="Times New Roman"/>
                 <w:sz w:val="19"/>
               </w:rPr>
-              <w:t>US-12: địa chỉ và phí giao hàng</w:t>
+              <w:t>US-14 giỏ hàng; US-12 checkout</w:t>
             </w:r>
           </w:p>
         </w:tc>
@@ -2749,7 +2749,7 @@
                 <w:rFonts w:ascii="Times New Roman" w:hAnsi="Times New Roman"/>
                 <w:sz w:val="19"/>
               </w:rPr>
-              <w:t>Dự kiến; chưa có PR/merge</w:t>
+              <w:t>Chưa thấy commit/PR</w:t>
             </w:r>
           </w:p>
         </w:tc>
@@ -2800,7 +2800,7 @@
                 <w:rFonts w:ascii="Times New Roman" w:hAnsi="Times New Roman"/>
                 <w:sz w:val="19"/>
               </w:rPr>
-              <w:t>Dự kiến: feature/us16-catalog</w:t>
+              <w:t>test/update-readme</w:t>
             </w:r>
           </w:p>
         </w:tc>
@@ -2823,7 +2823,7 @@
                 <w:rFonts w:ascii="Times New Roman" w:hAnsi="Times New Roman"/>
                 <w:sz w:val="19"/>
               </w:rPr>
-              <w:t>US-16: quản lý sản phẩm và banner</w:t>
+              <w:t>Sửa README; backlog US-16/08</w:t>
             </w:r>
           </w:p>
         </w:tc>
@@ -2846,7 +2846,7 @@
                 <w:rFonts w:ascii="Times New Roman" w:hAnsi="Times New Roman"/>
                 <w:sz w:val="19"/>
               </w:rPr>
-              <w:t>Mẫu: feat: update admin catalog</w:t>
+              <w:t>77e3741 docs: cập nhật README để test luồng pull request</w:t>
             </w:r>
           </w:p>
         </w:tc>
@@ -2869,7 +2869,7 @@
                 <w:rFonts w:ascii="Times New Roman" w:hAnsi="Times New Roman"/>
                 <w:sz w:val="19"/>
               </w:rPr>
-              <w:t>Dự kiến; chưa có PR/merge</w:t>
+              <w:t>Branch đã push; chưa có PR</w:t>
             </w:r>
           </w:p>
         </w:tc>
@@ -3494,7 +3494,7 @@
                 <w:rFonts w:ascii="Times New Roman" w:hAnsi="Times New Roman"/>
                 <w:sz w:val="21"/>
               </w:rPr>
-              <w:t>Approve triển khai trên branch theo yêu cầu chủ repo; merge chờ review PR #1.</w:t>
+              <w:t>Approve; PR #1 đã merge, chưa có review.</w:t>
             </w:r>
           </w:p>
         </w:tc>
@@ -4424,7 +4424,7 @@
           <w:rFonts w:ascii="Times New Roman" w:hAnsi="Times New Roman"/>
           <w:sz w:val="24"/>
         </w:rPr>
-        <w:t>Tên file/vị trí lưu: evidence/lab3/registration_test_data.json</w:t>
+        <w:t>Tên file/vị trí lưu: test/test-data/registration_test_data.json</w:t>
       </w:r>
     </w:p>
     <w:p>
@@ -4730,7 +4730,7 @@
           <w:rFonts w:ascii="Times New Roman" w:hAnsi="Times New Roman"/>
           <w:sz w:val="22"/>
         </w:rPr>
-        <w:t>Còn cần nhóm xác nhận: lớp, quyền truy cập, tài liệu Tuần 1–2, branch/commit thực tế của ba thành viên còn lại, review và merge PR #1.</w:t>
+        <w:t>Còn cần nhóm xác nhận: lớp, quyền truy cập, tài liệu Tuần 1–2, commit của Trương Đức Phú, review của thành viên khác và PR/merge cho branch test/update-readme.</w:t>
       </w:r>
     </w:p>
     <w:p>

</xml_diff>